<commit_message>
integrated kafka so users can send and recieve message
</commit_message>
<xml_diff>
--- a/Functional requirement.docx
+++ b/Functional requirement.docx
@@ -195,10 +195,24 @@
           <w:ilvl w:val="0"/>
           <w:numId w:val="1"/>
         </w:numPr>
+        <w:rPr>
+          <w:b/>
+          <w:bCs/>
+        </w:rPr>
       </w:pPr>
       <w:r>
         <w:t>User can send message to other users</w:t>
       </w:r>
+      <w:r>
+        <w:t xml:space="preserve"> = </w:t>
+      </w:r>
+      <w:r>
+        <w:rPr>
+          <w:b/>
+          <w:bCs/>
+        </w:rPr>
+        <w:t>DONE</w:t>
+      </w:r>
     </w:p>
     <w:p>
       <w:pPr>
@@ -207,9 +221,23 @@
           <w:ilvl w:val="0"/>
           <w:numId w:val="1"/>
         </w:numPr>
+        <w:rPr>
+          <w:b/>
+          <w:bCs/>
+        </w:rPr>
       </w:pPr>
       <w:r>
         <w:t>Admin can delete users</w:t>
+      </w:r>
+      <w:r>
+        <w:t xml:space="preserve"> = </w:t>
+      </w:r>
+      <w:r>
+        <w:rPr>
+          <w:b/>
+          <w:bCs/>
+        </w:rPr>
+        <w:t>DONE</w:t>
       </w:r>
     </w:p>
     <w:p>

</xml_diff>

<commit_message>
added a way to count number of users and number of prisoners to show report and also made a calculation of the total number of years of prison for each prisoner
</commit_message>
<xml_diff>
--- a/Functional requirement.docx
+++ b/Functional requirement.docx
@@ -183,10 +183,24 @@
           <w:ilvl w:val="0"/>
           <w:numId w:val="1"/>
         </w:numPr>
+        <w:rPr>
+          <w:b/>
+          <w:bCs/>
+        </w:rPr>
       </w:pPr>
       <w:r>
         <w:t>User can read other people stories</w:t>
       </w:r>
+      <w:r>
+        <w:t xml:space="preserve"> = </w:t>
+      </w:r>
+      <w:r>
+        <w:rPr>
+          <w:b/>
+          <w:bCs/>
+        </w:rPr>
+        <w:t>DONE</w:t>
+      </w:r>
     </w:p>
     <w:p>
       <w:pPr>
@@ -252,6 +266,117 @@
           <w:b/>
           <w:bCs/>
         </w:rPr>
+        <w:t>To Do</w:t>
+      </w:r>
+    </w:p>
+    <w:p>
+      <w:pPr>
+        <w:pStyle w:val="ListParagraph"/>
+        <w:numPr>
+          <w:ilvl w:val="0"/>
+          <w:numId w:val="10"/>
+        </w:numPr>
+        <w:rPr>
+          <w:b/>
+          <w:bCs/>
+        </w:rPr>
+      </w:pPr>
+      <w:r>
+        <w:t>Calculate the number of  years a person is imprisoned</w:t>
+      </w:r>
+      <w:r>
+        <w:t xml:space="preserve"> = </w:t>
+      </w:r>
+      <w:r>
+        <w:rPr>
+          <w:b/>
+          <w:bCs/>
+        </w:rPr>
+        <w:t>DONE</w:t>
+      </w:r>
+    </w:p>
+    <w:p>
+      <w:pPr>
+        <w:pStyle w:val="ListParagraph"/>
+        <w:numPr>
+          <w:ilvl w:val="0"/>
+          <w:numId w:val="10"/>
+        </w:numPr>
+      </w:pPr>
+      <w:r>
+        <w:t>Add all possible prisons as Enum</w:t>
+      </w:r>
+    </w:p>
+    <w:p>
+      <w:pPr>
+        <w:pStyle w:val="ListParagraph"/>
+        <w:numPr>
+          <w:ilvl w:val="0"/>
+          <w:numId w:val="10"/>
+        </w:numPr>
+        <w:rPr>
+          <w:b/>
+          <w:bCs/>
+        </w:rPr>
+      </w:pPr>
+      <w:r>
+        <w:t>Show a statical report of number of prisoners in each prison(graphical if possible)</w:t>
+      </w:r>
+      <w:r>
+        <w:t xml:space="preserve">= </w:t>
+      </w:r>
+      <w:r>
+        <w:rPr>
+          <w:b/>
+          <w:bCs/>
+        </w:rPr>
+        <w:t>DONE</w:t>
+      </w:r>
+    </w:p>
+    <w:p>
+      <w:pPr>
+        <w:pStyle w:val="ListParagraph"/>
+        <w:numPr>
+          <w:ilvl w:val="0"/>
+          <w:numId w:val="10"/>
+        </w:numPr>
+      </w:pPr>
+      <w:r>
+        <w:t xml:space="preserve">Add all prisoners(G-15) and from </w:t>
+      </w:r>
+      <w:proofErr w:type="spellStart"/>
+      <w:r>
+        <w:t>sakitsm</w:t>
+      </w:r>
+      <w:proofErr w:type="spellEnd"/>
+      <w:r>
+        <w:t xml:space="preserve"> as reference</w:t>
+      </w:r>
+    </w:p>
+    <w:p>
+      <w:pPr>
+        <w:pStyle w:val="ListParagraph"/>
+        <w:numPr>
+          <w:ilvl w:val="0"/>
+          <w:numId w:val="10"/>
+        </w:numPr>
+      </w:pPr>
+      <w:r>
+        <w:t>Show Eritrean constitution in dashboard</w:t>
+      </w:r>
+    </w:p>
+    <w:p>
+      <w:pPr>
+        <w:rPr>
+          <w:b/>
+          <w:bCs/>
+        </w:rPr>
+      </w:pPr>
+      <w:r>
+        <w:rPr>
+          <w:b/>
+          <w:bCs/>
+        </w:rPr>
         <w:t>Nonfunctional requirement</w:t>
       </w:r>
     </w:p>
@@ -364,7 +489,23 @@
           <w:b/>
           <w:bCs/>
         </w:rPr>
-        <w:t>RDS(MySQl)</w:t>
+        <w:t>RDS(</w:t>
+      </w:r>
+      <w:proofErr w:type="spellStart"/>
+      <w:r>
+        <w:rPr>
+          <w:b/>
+          <w:bCs/>
+        </w:rPr>
+        <w:t>MySQl</w:t>
+      </w:r>
+      <w:proofErr w:type="spellEnd"/>
+      <w:r>
+        <w:rPr>
+          <w:b/>
+          <w:bCs/>
+        </w:rPr>
+        <w:t>)</w:t>
       </w:r>
     </w:p>
     <w:p>
@@ -520,6 +661,7 @@
           <w:b/>
           <w:bCs/>
         </w:rPr>
+        <w:lastRenderedPageBreak/>
         <w:t>S3</w:t>
       </w:r>
     </w:p>
@@ -1031,6 +1173,119 @@
     </w:lvl>
   </w:abstractNum>
   <w:abstractNum w:abstractNumId="2" w15:restartNumberingAfterBreak="0">
+    <w:nsid w:val="22B77041"/>
+    <w:multiLevelType w:val="hybridMultilevel"/>
+    <w:tmpl w:val="8D5EFBDA"/>
+    <w:lvl w:ilvl="0" w:tplc="04090001">
+      <w:start w:val="1"/>
+      <w:numFmt w:val="bullet"/>
+      <w:lvlText w:val=""/>
+      <w:lvlJc w:val="left"/>
+      <w:pPr>
+        <w:ind w:left="720" w:hanging="360"/>
+      </w:pPr>
+      <w:rPr>
+        <w:rFonts w:ascii="Symbol" w:hAnsi="Symbol" w:hint="default"/>
+      </w:rPr>
+    </w:lvl>
+    <w:lvl w:ilvl="1" w:tplc="04090003" w:tentative="1">
+      <w:start w:val="1"/>
+      <w:numFmt w:val="bullet"/>
+      <w:lvlText w:val="o"/>
+      <w:lvlJc w:val="left"/>
+      <w:pPr>
+        <w:ind w:left="1440" w:hanging="360"/>
+      </w:pPr>
+      <w:rPr>
+        <w:rFonts w:ascii="Courier New" w:hAnsi="Courier New" w:cs="Courier New" w:hint="default"/>
+      </w:rPr>
+    </w:lvl>
+    <w:lvl w:ilvl="2" w:tplc="04090005" w:tentative="1">
+      <w:start w:val="1"/>
+      <w:numFmt w:val="bullet"/>
+      <w:lvlText w:val=""/>
+      <w:lvlJc w:val="left"/>
+      <w:pPr>
+        <w:ind w:left="2160" w:hanging="360"/>
+      </w:pPr>
+      <w:rPr>
+        <w:rFonts w:ascii="Wingdings" w:hAnsi="Wingdings" w:hint="default"/>
+      </w:rPr>
+    </w:lvl>
+    <w:lvl w:ilvl="3" w:tplc="04090001" w:tentative="1">
+      <w:start w:val="1"/>
+      <w:numFmt w:val="bullet"/>
+      <w:lvlText w:val=""/>
+      <w:lvlJc w:val="left"/>
+      <w:pPr>
+        <w:ind w:left="2880" w:hanging="360"/>
+      </w:pPr>
+      <w:rPr>
+        <w:rFonts w:ascii="Symbol" w:hAnsi="Symbol" w:hint="default"/>
+      </w:rPr>
+    </w:lvl>
+    <w:lvl w:ilvl="4" w:tplc="04090003" w:tentative="1">
+      <w:start w:val="1"/>
+      <w:numFmt w:val="bullet"/>
+      <w:lvlText w:val="o"/>
+      <w:lvlJc w:val="left"/>
+      <w:pPr>
+        <w:ind w:left="3600" w:hanging="360"/>
+      </w:pPr>
+      <w:rPr>
+        <w:rFonts w:ascii="Courier New" w:hAnsi="Courier New" w:cs="Courier New" w:hint="default"/>
+      </w:rPr>
+    </w:lvl>
+    <w:lvl w:ilvl="5" w:tplc="04090005" w:tentative="1">
+      <w:start w:val="1"/>
+      <w:numFmt w:val="bullet"/>
+      <w:lvlText w:val=""/>
+      <w:lvlJc w:val="left"/>
+      <w:pPr>
+        <w:ind w:left="4320" w:hanging="360"/>
+      </w:pPr>
+      <w:rPr>
+        <w:rFonts w:ascii="Wingdings" w:hAnsi="Wingdings" w:hint="default"/>
+      </w:rPr>
+    </w:lvl>
+    <w:lvl w:ilvl="6" w:tplc="04090001" w:tentative="1">
+      <w:start w:val="1"/>
+      <w:numFmt w:val="bullet"/>
+      <w:lvlText w:val=""/>
+      <w:lvlJc w:val="left"/>
+      <w:pPr>
+        <w:ind w:left="5040" w:hanging="360"/>
+      </w:pPr>
+      <w:rPr>
+        <w:rFonts w:ascii="Symbol" w:hAnsi="Symbol" w:hint="default"/>
+      </w:rPr>
+    </w:lvl>
+    <w:lvl w:ilvl="7" w:tplc="04090003" w:tentative="1">
+      <w:start w:val="1"/>
+      <w:numFmt w:val="bullet"/>
+      <w:lvlText w:val="o"/>
+      <w:lvlJc w:val="left"/>
+      <w:pPr>
+        <w:ind w:left="5760" w:hanging="360"/>
+      </w:pPr>
+      <w:rPr>
+        <w:rFonts w:ascii="Courier New" w:hAnsi="Courier New" w:cs="Courier New" w:hint="default"/>
+      </w:rPr>
+    </w:lvl>
+    <w:lvl w:ilvl="8" w:tplc="04090005" w:tentative="1">
+      <w:start w:val="1"/>
+      <w:numFmt w:val="bullet"/>
+      <w:lvlText w:val=""/>
+      <w:lvlJc w:val="left"/>
+      <w:pPr>
+        <w:ind w:left="6480" w:hanging="360"/>
+      </w:pPr>
+      <w:rPr>
+        <w:rFonts w:ascii="Wingdings" w:hAnsi="Wingdings" w:hint="default"/>
+      </w:rPr>
+    </w:lvl>
+  </w:abstractNum>
+  <w:abstractNum w:abstractNumId="3" w15:restartNumberingAfterBreak="0">
     <w:nsid w:val="2A181BC5"/>
     <w:multiLevelType w:val="hybridMultilevel"/>
     <w:tmpl w:val="0896B188"/>
@@ -1143,7 +1398,7 @@
       </w:rPr>
     </w:lvl>
   </w:abstractNum>
-  <w:abstractNum w:abstractNumId="3" w15:restartNumberingAfterBreak="0">
+  <w:abstractNum w:abstractNumId="4" w15:restartNumberingAfterBreak="0">
     <w:nsid w:val="3AB152E1"/>
     <w:multiLevelType w:val="hybridMultilevel"/>
     <w:tmpl w:val="AFE6AF58"/>
@@ -1256,7 +1511,7 @@
       </w:rPr>
     </w:lvl>
   </w:abstractNum>
-  <w:abstractNum w:abstractNumId="4" w15:restartNumberingAfterBreak="0">
+  <w:abstractNum w:abstractNumId="5" w15:restartNumberingAfterBreak="0">
     <w:nsid w:val="4A7B0E2E"/>
     <w:multiLevelType w:val="hybridMultilevel"/>
     <w:tmpl w:val="77EE809E"/>
@@ -1369,7 +1624,7 @@
       </w:rPr>
     </w:lvl>
   </w:abstractNum>
-  <w:abstractNum w:abstractNumId="5" w15:restartNumberingAfterBreak="0">
+  <w:abstractNum w:abstractNumId="6" w15:restartNumberingAfterBreak="0">
     <w:nsid w:val="4F2F76FC"/>
     <w:multiLevelType w:val="hybridMultilevel"/>
     <w:tmpl w:val="F044FA9C"/>
@@ -1482,7 +1737,7 @@
       </w:rPr>
     </w:lvl>
   </w:abstractNum>
-  <w:abstractNum w:abstractNumId="6" w15:restartNumberingAfterBreak="0">
+  <w:abstractNum w:abstractNumId="7" w15:restartNumberingAfterBreak="0">
     <w:nsid w:val="530B1818"/>
     <w:multiLevelType w:val="hybridMultilevel"/>
     <w:tmpl w:val="232EF1F0"/>
@@ -1595,7 +1850,7 @@
       </w:rPr>
     </w:lvl>
   </w:abstractNum>
-  <w:abstractNum w:abstractNumId="7" w15:restartNumberingAfterBreak="0">
+  <w:abstractNum w:abstractNumId="8" w15:restartNumberingAfterBreak="0">
     <w:nsid w:val="68EA31DA"/>
     <w:multiLevelType w:val="hybridMultilevel"/>
     <w:tmpl w:val="5FD87646"/>
@@ -1684,7 +1939,7 @@
       </w:pPr>
     </w:lvl>
   </w:abstractNum>
-  <w:abstractNum w:abstractNumId="8" w15:restartNumberingAfterBreak="0">
+  <w:abstractNum w:abstractNumId="9" w15:restartNumberingAfterBreak="0">
     <w:nsid w:val="721603C0"/>
     <w:multiLevelType w:val="hybridMultilevel"/>
     <w:tmpl w:val="FB081B40"/>
@@ -1798,31 +2053,34 @@
     </w:lvl>
   </w:abstractNum>
   <w:num w:numId="1" w16cid:durableId="1427842018">
-    <w:abstractNumId w:val="6"/>
+    <w:abstractNumId w:val="7"/>
   </w:num>
   <w:num w:numId="2" w16cid:durableId="4090851">
-    <w:abstractNumId w:val="3"/>
+    <w:abstractNumId w:val="4"/>
   </w:num>
   <w:num w:numId="3" w16cid:durableId="1732656005">
-    <w:abstractNumId w:val="7"/>
+    <w:abstractNumId w:val="8"/>
   </w:num>
   <w:num w:numId="4" w16cid:durableId="737477251">
     <w:abstractNumId w:val="1"/>
   </w:num>
   <w:num w:numId="5" w16cid:durableId="1873491662">
-    <w:abstractNumId w:val="2"/>
+    <w:abstractNumId w:val="3"/>
   </w:num>
   <w:num w:numId="6" w16cid:durableId="1316951489">
-    <w:abstractNumId w:val="5"/>
+    <w:abstractNumId w:val="6"/>
   </w:num>
   <w:num w:numId="7" w16cid:durableId="1077632038">
-    <w:abstractNumId w:val="8"/>
+    <w:abstractNumId w:val="9"/>
   </w:num>
   <w:num w:numId="8" w16cid:durableId="1207256156">
-    <w:abstractNumId w:val="4"/>
+    <w:abstractNumId w:val="5"/>
   </w:num>
   <w:num w:numId="9" w16cid:durableId="39327094">
     <w:abstractNumId w:val="0"/>
+  </w:num>
+  <w:num w:numId="10" w16cid:durableId="780953310">
+    <w:abstractNumId w:val="2"/>
   </w:num>
 </w:numbering>
 </file>

</xml_diff>